<commit_message>
Aggiunto HANDOVER; README e documentazione tecnica descrivono il repository file per file
Co-Authored-By: Claude Opus 5.5 <noreply@anthropic.com>
</commit_message>
<xml_diff>
--- a/docs/01_DOCUMENTAZIONE_TECNICA.docx
+++ b/docs/01_DOCUMENTAZIONE_TECNICA.docx
@@ -485,6 +485,75 @@
                 <w:szCs w:val="18"/>
               </w:rPr>
               <w:t xml:space="preserve">Ogni tabella di output: da quali dati parte, quali calcoli fa, che forma ha.</w:t>
+            </w:r>
+          </w:p>
+        </w:tc>
+      </w:tr>
+      <w:tr>
+        <w:trPr>
+          <w:tblHeader w:val="off"/>
+        </w:trPr>
+        <w:tc>
+          <w:tcPr>
+            <w:tcW w:type="dxa" w:w="3822"/>
+            <w:tcBorders>
+              <w:top w:val="single" w:color="A6A6A6" w:sz="4"/>
+              <w:left w:val="single" w:color="A6A6A6" w:sz="4"/>
+              <w:bottom w:val="single" w:color="A6A6A6" w:sz="4"/>
+              <w:right w:val="single" w:color="A6A6A6" w:sz="4"/>
+            </w:tcBorders>
+            <w:tcMar>
+              <w:top w:type="dxa" w:w="40"/>
+              <w:left w:type="dxa" w:w="80"/>
+              <w:bottom w:type="dxa" w:w="40"/>
+              <w:right w:type="dxa" w:w="80"/>
+            </w:tcMar>
+          </w:tcPr>
+          <w:p>
+            <w:pPr>
+              <w:spacing w:after="0"/>
+            </w:pPr>
+            <w:r>
+              <w:rPr>
+                <w:rFonts w:ascii="Consolas" w:cs="Consolas" w:eastAsia="Consolas" w:hAnsi="Consolas"/>
+                <w:b w:val="false"/>
+                <w:bCs w:val="false"/>
+                <w:color w:val="7A1F1F"/>
+                <w:sz w:val="18"/>
+                <w:szCs w:val="18"/>
+              </w:rPr>
+              <w:t xml:space="preserve">HANDOVER.md</w:t>
+            </w:r>
+          </w:p>
+        </w:tc>
+        <w:tc>
+          <w:tcPr>
+            <w:tcW w:type="dxa" w:w="5816"/>
+            <w:tcBorders>
+              <w:top w:val="single" w:color="A6A6A6" w:sz="4"/>
+              <w:left w:val="single" w:color="A6A6A6" w:sz="4"/>
+              <w:bottom w:val="single" w:color="A6A6A6" w:sz="4"/>
+              <w:right w:val="single" w:color="A6A6A6" w:sz="4"/>
+            </w:tcBorders>
+            <w:tcMar>
+              <w:top w:type="dxa" w:w="40"/>
+              <w:left w:type="dxa" w:w="80"/>
+              <w:bottom w:type="dxa" w:w="40"/>
+              <w:right w:type="dxa" w:w="80"/>
+            </w:tcMar>
+          </w:tcPr>
+          <w:p>
+            <w:pPr>
+              <w:spacing w:after="0"/>
+            </w:pPr>
+            <w:r>
+              <w:rPr>
+                <w:b w:val="false"/>
+                <w:bCs w:val="false"/>
+                <w:sz w:val="18"/>
+                <w:szCs w:val="18"/>
+              </w:rPr>
+              <w:t xml:space="preserve">Registro tecnico dettagliato, scritto durante lo sviluppo in ordine cronologico: decisioni, verifiche, pubblicazioni. Serve per i dettagli; cita anche test e file di prova che non sono nel repository.</w:t>
             </w:r>
           </w:p>
         </w:tc>
@@ -2833,7 +2902,7 @@
           <w:sz w:val="13"/>
           <w:szCs w:val="13"/>
         </w:rPr>
-        <w:t xml:space="preserve">├── docs/                          questa documentazione e la specifica delle tabelle (anche in .docx)</w:t>
+        <w:t xml:space="preserve">├── docs/                          01_DOCUMENTAZIONE_TECNICA, 02_TABELLE_DI_OUTPUT, HANDOVER (.md e .docx)</w:t>
       </w:r>
     </w:p>
     <w:p>
@@ -2979,7 +3048,863 @@
     <w:p/>
     <w:p>
       <w:r>
-        <w:t xml:space="preserve">Ogni cartella dei siti contiene la pagina (</w:t>
+        <w:t xml:space="preserve">I numeri delle cartelle sono quelli originali: le cartelle 3, 4 e 5 erano versioni precedenti o strumenti secondari e non fanno parte del repository.</w:t>
+      </w:r>
+    </w:p>
+    <w:p>
+      <w:r>
+        <w:rPr>
+          <w:b/>
+          <w:bCs/>
+        </w:rPr>
+        <w:t xml:space="preserve">File di ogni sito</w:t>
+      </w:r>
+    </w:p>
+    <w:tbl>
+      <w:tblPr>
+        <w:tblW w:type="dxa" w:w="9638"/>
+        <w:tblBorders>
+          <w:top w:val="single" w:color="auto" w:sz="4"/>
+          <w:left w:val="single" w:color="auto" w:sz="4"/>
+          <w:bottom w:val="single" w:color="auto" w:sz="4"/>
+          <w:right w:val="single" w:color="auto" w:sz="4"/>
+          <w:insideH w:val="single" w:color="auto" w:sz="4"/>
+          <w:insideV w:val="single" w:color="auto" w:sz="4"/>
+        </w:tblBorders>
+      </w:tblPr>
+      <w:tblGrid>
+        <w:gridCol w:w="3551"/>
+        <w:gridCol w:w="1925"/>
+        <w:gridCol w:w="4162"/>
+      </w:tblGrid>
+      <w:tr>
+        <w:trPr>
+          <w:tblHeader/>
+        </w:trPr>
+        <w:tc>
+          <w:tcPr>
+            <w:tcW w:type="dxa" w:w="3551"/>
+            <w:tcBorders>
+              <w:top w:val="single" w:color="A6A6A6" w:sz="4"/>
+              <w:left w:val="single" w:color="A6A6A6" w:sz="4"/>
+              <w:bottom w:val="single" w:color="A6A6A6" w:sz="4"/>
+              <w:right w:val="single" w:color="A6A6A6" w:sz="4"/>
+            </w:tcBorders>
+            <w:shd w:fill="DCE9F5" w:color="auto" w:val="clear"/>
+            <w:tcMar>
+              <w:top w:type="dxa" w:w="40"/>
+              <w:left w:type="dxa" w:w="80"/>
+              <w:bottom w:type="dxa" w:w="40"/>
+              <w:right w:type="dxa" w:w="80"/>
+            </w:tcMar>
+          </w:tcPr>
+          <w:p>
+            <w:pPr>
+              <w:spacing w:after="0"/>
+            </w:pPr>
+            <w:r>
+              <w:rPr>
+                <w:b/>
+                <w:bCs/>
+                <w:sz w:val="18"/>
+                <w:szCs w:val="18"/>
+              </w:rPr>
+              <w:t xml:space="preserve">File</w:t>
+            </w:r>
+          </w:p>
+        </w:tc>
+        <w:tc>
+          <w:tcPr>
+            <w:tcW w:type="dxa" w:w="1925"/>
+            <w:tcBorders>
+              <w:top w:val="single" w:color="A6A6A6" w:sz="4"/>
+              <w:left w:val="single" w:color="A6A6A6" w:sz="4"/>
+              <w:bottom w:val="single" w:color="A6A6A6" w:sz="4"/>
+              <w:right w:val="single" w:color="A6A6A6" w:sz="4"/>
+            </w:tcBorders>
+            <w:shd w:fill="DCE9F5" w:color="auto" w:val="clear"/>
+            <w:tcMar>
+              <w:top w:type="dxa" w:w="40"/>
+              <w:left w:type="dxa" w:w="80"/>
+              <w:bottom w:type="dxa" w:w="40"/>
+              <w:right w:type="dxa" w:w="80"/>
+            </w:tcMar>
+          </w:tcPr>
+          <w:p>
+            <w:pPr>
+              <w:spacing w:after="0"/>
+            </w:pPr>
+            <w:r>
+              <w:rPr>
+                <w:b/>
+                <w:bCs/>
+                <w:sz w:val="18"/>
+                <w:szCs w:val="18"/>
+              </w:rPr>
+              <w:t xml:space="preserve">Presente in</w:t>
+            </w:r>
+          </w:p>
+        </w:tc>
+        <w:tc>
+          <w:tcPr>
+            <w:tcW w:type="dxa" w:w="4162"/>
+            <w:tcBorders>
+              <w:top w:val="single" w:color="A6A6A6" w:sz="4"/>
+              <w:left w:val="single" w:color="A6A6A6" w:sz="4"/>
+              <w:bottom w:val="single" w:color="A6A6A6" w:sz="4"/>
+              <w:right w:val="single" w:color="A6A6A6" w:sz="4"/>
+            </w:tcBorders>
+            <w:shd w:fill="DCE9F5" w:color="auto" w:val="clear"/>
+            <w:tcMar>
+              <w:top w:type="dxa" w:w="40"/>
+              <w:left w:type="dxa" w:w="80"/>
+              <w:bottom w:type="dxa" w:w="40"/>
+              <w:right w:type="dxa" w:w="80"/>
+            </w:tcMar>
+          </w:tcPr>
+          <w:p>
+            <w:pPr>
+              <w:spacing w:after="0"/>
+            </w:pPr>
+            <w:r>
+              <w:rPr>
+                <w:b/>
+                <w:bCs/>
+                <w:sz w:val="18"/>
+                <w:szCs w:val="18"/>
+              </w:rPr>
+              <w:t xml:space="preserve">Ruolo</w:t>
+            </w:r>
+          </w:p>
+        </w:tc>
+      </w:tr>
+      <w:tr>
+        <w:trPr>
+          <w:tblHeader w:val="off"/>
+        </w:trPr>
+        <w:tc>
+          <w:tcPr>
+            <w:tcW w:type="dxa" w:w="3551"/>
+            <w:tcBorders>
+              <w:top w:val="single" w:color="A6A6A6" w:sz="4"/>
+              <w:left w:val="single" w:color="A6A6A6" w:sz="4"/>
+              <w:bottom w:val="single" w:color="A6A6A6" w:sz="4"/>
+              <w:right w:val="single" w:color="A6A6A6" w:sz="4"/>
+            </w:tcBorders>
+            <w:tcMar>
+              <w:top w:type="dxa" w:w="40"/>
+              <w:left w:type="dxa" w:w="80"/>
+              <w:bottom w:type="dxa" w:w="40"/>
+              <w:right w:type="dxa" w:w="80"/>
+            </w:tcMar>
+          </w:tcPr>
+          <w:p>
+            <w:pPr>
+              <w:spacing w:after="0"/>
+            </w:pPr>
+            <w:r>
+              <w:rPr>
+                <w:rFonts w:ascii="Consolas" w:cs="Consolas" w:eastAsia="Consolas" w:hAnsi="Consolas"/>
+                <w:b w:val="false"/>
+                <w:bCs w:val="false"/>
+                <w:color w:val="7A1F1F"/>
+                <w:sz w:val="18"/>
+                <w:szCs w:val="18"/>
+              </w:rPr>
+              <w:t xml:space="preserve">index.html</w:t>
+            </w:r>
+          </w:p>
+        </w:tc>
+        <w:tc>
+          <w:tcPr>
+            <w:tcW w:type="dxa" w:w="1925"/>
+            <w:tcBorders>
+              <w:top w:val="single" w:color="A6A6A6" w:sz="4"/>
+              <w:left w:val="single" w:color="A6A6A6" w:sz="4"/>
+              <w:bottom w:val="single" w:color="A6A6A6" w:sz="4"/>
+              <w:right w:val="single" w:color="A6A6A6" w:sz="4"/>
+            </w:tcBorders>
+            <w:tcMar>
+              <w:top w:type="dxa" w:w="40"/>
+              <w:left w:type="dxa" w:w="80"/>
+              <w:bottom w:type="dxa" w:w="40"/>
+              <w:right w:type="dxa" w:w="80"/>
+            </w:tcMar>
+          </w:tcPr>
+          <w:p>
+            <w:pPr>
+              <w:spacing w:after="0"/>
+            </w:pPr>
+            <w:r>
+              <w:rPr>
+                <w:b w:val="false"/>
+                <w:bCs w:val="false"/>
+                <w:sz w:val="18"/>
+                <w:szCs w:val="18"/>
+              </w:rPr>
+              <w:t xml:space="preserve">tutti i siti</w:t>
+            </w:r>
+          </w:p>
+        </w:tc>
+        <w:tc>
+          <w:tcPr>
+            <w:tcW w:type="dxa" w:w="4162"/>
+            <w:tcBorders>
+              <w:top w:val="single" w:color="A6A6A6" w:sz="4"/>
+              <w:left w:val="single" w:color="A6A6A6" w:sz="4"/>
+              <w:bottom w:val="single" w:color="A6A6A6" w:sz="4"/>
+              <w:right w:val="single" w:color="A6A6A6" w:sz="4"/>
+            </w:tcBorders>
+            <w:tcMar>
+              <w:top w:type="dxa" w:w="40"/>
+              <w:left w:type="dxa" w:w="80"/>
+              <w:bottom w:type="dxa" w:w="40"/>
+              <w:right w:type="dxa" w:w="80"/>
+            </w:tcMar>
+          </w:tcPr>
+          <w:p>
+            <w:pPr>
+              <w:spacing w:after="0"/>
+            </w:pPr>
+            <w:r>
+              <w:rPr>
+                <w:b w:val="false"/>
+                <w:bCs w:val="false"/>
+                <w:sz w:val="18"/>
+                <w:szCs w:val="18"/>
+              </w:rPr>
+              <w:t xml:space="preserve">La pagina: motore (</w:t>
+            </w:r>
+            <w:r>
+              <w:rPr>
+                <w:rFonts w:ascii="Consolas" w:cs="Consolas" w:eastAsia="Consolas" w:hAnsi="Consolas"/>
+                <w:b w:val="false"/>
+                <w:bCs w:val="false"/>
+                <w:color w:val="7A1F1F"/>
+                <w:sz w:val="18"/>
+                <w:szCs w:val="18"/>
+              </w:rPr>
+              <w:t xml:space="preserve">&lt;script id="motore"&gt;</w:t>
+            </w:r>
+            <w:r>
+              <w:rPr>
+                <w:b w:val="false"/>
+                <w:bCs w:val="false"/>
+                <w:sz w:val="18"/>
+                <w:szCs w:val="18"/>
+              </w:rPr>
+              <w:t xml:space="preserve">) e interfaccia (§3.2).</w:t>
+            </w:r>
+          </w:p>
+        </w:tc>
+      </w:tr>
+      <w:tr>
+        <w:trPr>
+          <w:tblHeader w:val="off"/>
+        </w:trPr>
+        <w:tc>
+          <w:tcPr>
+            <w:tcW w:type="dxa" w:w="3551"/>
+            <w:tcBorders>
+              <w:top w:val="single" w:color="A6A6A6" w:sz="4"/>
+              <w:left w:val="single" w:color="A6A6A6" w:sz="4"/>
+              <w:bottom w:val="single" w:color="A6A6A6" w:sz="4"/>
+              <w:right w:val="single" w:color="A6A6A6" w:sz="4"/>
+            </w:tcBorders>
+            <w:tcMar>
+              <w:top w:type="dxa" w:w="40"/>
+              <w:left w:type="dxa" w:w="80"/>
+              <w:bottom w:type="dxa" w:w="40"/>
+              <w:right w:type="dxa" w:w="80"/>
+            </w:tcMar>
+          </w:tcPr>
+          <w:p>
+            <w:pPr>
+              <w:spacing w:after="0"/>
+            </w:pPr>
+            <w:r>
+              <w:rPr>
+                <w:rFonts w:ascii="Consolas" w:cs="Consolas" w:eastAsia="Consolas" w:hAnsi="Consolas"/>
+                <w:b w:val="false"/>
+                <w:bCs w:val="false"/>
+                <w:color w:val="7A1F1F"/>
+                <w:sz w:val="18"/>
+                <w:szCs w:val="18"/>
+              </w:rPr>
+              <w:t xml:space="preserve">LEGGIMI.txt</w:t>
+            </w:r>
+          </w:p>
+        </w:tc>
+        <w:tc>
+          <w:tcPr>
+            <w:tcW w:type="dxa" w:w="1925"/>
+            <w:tcBorders>
+              <w:top w:val="single" w:color="A6A6A6" w:sz="4"/>
+              <w:left w:val="single" w:color="A6A6A6" w:sz="4"/>
+              <w:bottom w:val="single" w:color="A6A6A6" w:sz="4"/>
+              <w:right w:val="single" w:color="A6A6A6" w:sz="4"/>
+            </w:tcBorders>
+            <w:tcMar>
+              <w:top w:type="dxa" w:w="40"/>
+              <w:left w:type="dxa" w:w="80"/>
+              <w:bottom w:type="dxa" w:w="40"/>
+              <w:right w:type="dxa" w:w="80"/>
+            </w:tcMar>
+          </w:tcPr>
+          <w:p>
+            <w:pPr>
+              <w:spacing w:after="0"/>
+            </w:pPr>
+            <w:r>
+              <w:rPr>
+                <w:b w:val="false"/>
+                <w:bCs w:val="false"/>
+                <w:sz w:val="18"/>
+                <w:szCs w:val="18"/>
+              </w:rPr>
+              <w:t xml:space="preserve">tutti i siti</w:t>
+            </w:r>
+          </w:p>
+        </w:tc>
+        <w:tc>
+          <w:tcPr>
+            <w:tcW w:type="dxa" w:w="4162"/>
+            <w:tcBorders>
+              <w:top w:val="single" w:color="A6A6A6" w:sz="4"/>
+              <w:left w:val="single" w:color="A6A6A6" w:sz="4"/>
+              <w:bottom w:val="single" w:color="A6A6A6" w:sz="4"/>
+              <w:right w:val="single" w:color="A6A6A6" w:sz="4"/>
+            </w:tcBorders>
+            <w:tcMar>
+              <w:top w:type="dxa" w:w="40"/>
+              <w:left w:type="dxa" w:w="80"/>
+              <w:bottom w:type="dxa" w:w="40"/>
+              <w:right w:type="dxa" w:w="80"/>
+            </w:tcMar>
+          </w:tcPr>
+          <w:p>
+            <w:pPr>
+              <w:spacing w:after="0"/>
+            </w:pPr>
+            <w:r>
+              <w:rPr>
+                <w:b w:val="false"/>
+                <w:bCs w:val="false"/>
+                <w:sz w:val="18"/>
+                <w:szCs w:val="18"/>
+              </w:rPr>
+              <w:t xml:space="preserve">Istruzioni per l'ufficio.</w:t>
+            </w:r>
+          </w:p>
+        </w:tc>
+      </w:tr>
+      <w:tr>
+        <w:trPr>
+          <w:tblHeader w:val="off"/>
+        </w:trPr>
+        <w:tc>
+          <w:tcPr>
+            <w:tcW w:type="dxa" w:w="3551"/>
+            <w:tcBorders>
+              <w:top w:val="single" w:color="A6A6A6" w:sz="4"/>
+              <w:left w:val="single" w:color="A6A6A6" w:sz="4"/>
+              <w:bottom w:val="single" w:color="A6A6A6" w:sz="4"/>
+              <w:right w:val="single" w:color="A6A6A6" w:sz="4"/>
+            </w:tcBorders>
+            <w:tcMar>
+              <w:top w:type="dxa" w:w="40"/>
+              <w:left w:type="dxa" w:w="80"/>
+              <w:bottom w:type="dxa" w:w="40"/>
+              <w:right w:type="dxa" w:w="80"/>
+            </w:tcMar>
+          </w:tcPr>
+          <w:p>
+            <w:pPr>
+              <w:spacing w:after="0"/>
+            </w:pPr>
+            <w:r>
+              <w:rPr>
+                <w:rFonts w:ascii="Consolas" w:cs="Consolas" w:eastAsia="Consolas" w:hAnsi="Consolas"/>
+                <w:b w:val="false"/>
+                <w:bCs w:val="false"/>
+                <w:color w:val="7A1F1F"/>
+                <w:sz w:val="18"/>
+                <w:szCs w:val="18"/>
+              </w:rPr>
+              <w:t xml:space="preserve">aggiorna_dati.py</w:t>
+            </w:r>
+            <w:r>
+              <w:rPr>
+                <w:b w:val="false"/>
+                <w:bCs w:val="false"/>
+                <w:sz w:val="18"/>
+                <w:szCs w:val="18"/>
+              </w:rPr>
+              <w:t xml:space="preserve"> (+ </w:t>
+            </w:r>
+            <w:r>
+              <w:rPr>
+                <w:rFonts w:ascii="Consolas" w:cs="Consolas" w:eastAsia="Consolas" w:hAnsi="Consolas"/>
+                <w:b w:val="false"/>
+                <w:bCs w:val="false"/>
+                <w:color w:val="7A1F1F"/>
+                <w:sz w:val="18"/>
+                <w:szCs w:val="18"/>
+              </w:rPr>
+              <w:t xml:space="preserve">aggiorna_cig.py</w:t>
+            </w:r>
+            <w:r>
+              <w:rPr>
+                <w:b w:val="false"/>
+                <w:bCs w:val="false"/>
+                <w:sz w:val="18"/>
+                <w:szCs w:val="18"/>
+              </w:rPr>
+              <w:t xml:space="preserve"> nel Lavoro)</w:t>
+            </w:r>
+          </w:p>
+        </w:tc>
+        <w:tc>
+          <w:tcPr>
+            <w:tcW w:type="dxa" w:w="1925"/>
+            <w:tcBorders>
+              <w:top w:val="single" w:color="A6A6A6" w:sz="4"/>
+              <w:left w:val="single" w:color="A6A6A6" w:sz="4"/>
+              <w:bottom w:val="single" w:color="A6A6A6" w:sz="4"/>
+              <w:right w:val="single" w:color="A6A6A6" w:sz="4"/>
+            </w:tcBorders>
+            <w:tcMar>
+              <w:top w:type="dxa" w:w="40"/>
+              <w:left w:type="dxa" w:w="80"/>
+              <w:bottom w:type="dxa" w:w="40"/>
+              <w:right w:type="dxa" w:w="80"/>
+            </w:tcMar>
+          </w:tcPr>
+          <w:p>
+            <w:pPr>
+              <w:spacing w:after="0"/>
+            </w:pPr>
+            <w:r>
+              <w:rPr>
+                <w:b w:val="false"/>
+                <w:bCs w:val="false"/>
+                <w:sz w:val="18"/>
+                <w:szCs w:val="18"/>
+              </w:rPr>
+              <w:t xml:space="preserve">7, 8, 9, 10, 11</w:t>
+            </w:r>
+          </w:p>
+        </w:tc>
+        <w:tc>
+          <w:tcPr>
+            <w:tcW w:type="dxa" w:w="4162"/>
+            <w:tcBorders>
+              <w:top w:val="single" w:color="A6A6A6" w:sz="4"/>
+              <w:left w:val="single" w:color="A6A6A6" w:sz="4"/>
+              <w:bottom w:val="single" w:color="A6A6A6" w:sz="4"/>
+              <w:right w:val="single" w:color="A6A6A6" w:sz="4"/>
+            </w:tcBorders>
+            <w:tcMar>
+              <w:top w:type="dxa" w:w="40"/>
+              <w:left w:type="dxa" w:w="80"/>
+              <w:bottom w:type="dxa" w:w="40"/>
+              <w:right w:type="dxa" w:w="80"/>
+            </w:tcMar>
+          </w:tcPr>
+          <w:p>
+            <w:pPr>
+              <w:spacing w:after="0"/>
+            </w:pPr>
+            <w:r>
+              <w:rPr>
+                <w:b/>
+                <w:bCs/>
+                <w:sz w:val="18"/>
+                <w:szCs w:val="18"/>
+              </w:rPr>
+              <w:t xml:space="preserve">Estrazione ed elaborazione</w:t>
+            </w:r>
+            <w:r>
+              <w:rPr>
+                <w:b w:val="false"/>
+                <w:bCs w:val="false"/>
+                <w:sz w:val="18"/>
+                <w:szCs w:val="18"/>
+              </w:rPr>
+              <w:t xml:space="preserve">: scarica, filtra, controlla e salva i dati in </w:t>
+            </w:r>
+            <w:r>
+              <w:rPr>
+                <w:rFonts w:ascii="Consolas" w:cs="Consolas" w:eastAsia="Consolas" w:hAnsi="Consolas"/>
+                <w:b w:val="false"/>
+                <w:bCs w:val="false"/>
+                <w:color w:val="7A1F1F"/>
+                <w:sz w:val="18"/>
+                <w:szCs w:val="18"/>
+              </w:rPr>
+              <w:t xml:space="preserve">dati/</w:t>
+            </w:r>
+            <w:r>
+              <w:rPr>
+                <w:b w:val="false"/>
+                <w:bCs w:val="false"/>
+                <w:sz w:val="18"/>
+                <w:szCs w:val="18"/>
+              </w:rPr>
+              <w:t xml:space="preserve"> (§3.4).</w:t>
+            </w:r>
+          </w:p>
+        </w:tc>
+      </w:tr>
+      <w:tr>
+        <w:trPr>
+          <w:tblHeader w:val="off"/>
+        </w:trPr>
+        <w:tc>
+          <w:tcPr>
+            <w:tcW w:type="dxa" w:w="3551"/>
+            <w:tcBorders>
+              <w:top w:val="single" w:color="A6A6A6" w:sz="4"/>
+              <w:left w:val="single" w:color="A6A6A6" w:sz="4"/>
+              <w:bottom w:val="single" w:color="A6A6A6" w:sz="4"/>
+              <w:right w:val="single" w:color="A6A6A6" w:sz="4"/>
+            </w:tcBorders>
+            <w:tcMar>
+              <w:top w:type="dxa" w:w="40"/>
+              <w:left w:type="dxa" w:w="80"/>
+              <w:bottom w:type="dxa" w:w="40"/>
+              <w:right w:type="dxa" w:w="80"/>
+            </w:tcMar>
+          </w:tcPr>
+          <w:p>
+            <w:pPr>
+              <w:spacing w:after="0"/>
+            </w:pPr>
+            <w:r>
+              <w:rPr>
+                <w:rFonts w:ascii="Consolas" w:cs="Consolas" w:eastAsia="Consolas" w:hAnsi="Consolas"/>
+                <w:b w:val="false"/>
+                <w:bCs w:val="false"/>
+                <w:color w:val="7A1F1F"/>
+                <w:sz w:val="18"/>
+                <w:szCs w:val="18"/>
+              </w:rPr>
+              <w:t xml:space="preserve">segnala_problemi.py</w:t>
+            </w:r>
+          </w:p>
+        </w:tc>
+        <w:tc>
+          <w:tcPr>
+            <w:tcW w:type="dxa" w:w="1925"/>
+            <w:tcBorders>
+              <w:top w:val="single" w:color="A6A6A6" w:sz="4"/>
+              <w:left w:val="single" w:color="A6A6A6" w:sz="4"/>
+              <w:bottom w:val="single" w:color="A6A6A6" w:sz="4"/>
+              <w:right w:val="single" w:color="A6A6A6" w:sz="4"/>
+            </w:tcBorders>
+            <w:tcMar>
+              <w:top w:type="dxa" w:w="40"/>
+              <w:left w:type="dxa" w:w="80"/>
+              <w:bottom w:type="dxa" w:w="40"/>
+              <w:right w:type="dxa" w:w="80"/>
+            </w:tcMar>
+          </w:tcPr>
+          <w:p>
+            <w:pPr>
+              <w:spacing w:after="0"/>
+            </w:pPr>
+            <w:r>
+              <w:rPr>
+                <w:b w:val="false"/>
+                <w:bCs w:val="false"/>
+                <w:sz w:val="18"/>
+                <w:szCs w:val="18"/>
+              </w:rPr>
+              <w:t xml:space="preserve">7, 8, 9, 10, 11</w:t>
+            </w:r>
+          </w:p>
+        </w:tc>
+        <w:tc>
+          <w:tcPr>
+            <w:tcW w:type="dxa" w:w="4162"/>
+            <w:tcBorders>
+              <w:top w:val="single" w:color="A6A6A6" w:sz="4"/>
+              <w:left w:val="single" w:color="A6A6A6" w:sz="4"/>
+              <w:bottom w:val="single" w:color="A6A6A6" w:sz="4"/>
+              <w:right w:val="single" w:color="A6A6A6" w:sz="4"/>
+            </w:tcBorders>
+            <w:tcMar>
+              <w:top w:type="dxa" w:w="40"/>
+              <w:left w:type="dxa" w:w="80"/>
+              <w:bottom w:type="dxa" w:w="40"/>
+              <w:right w:type="dxa" w:w="80"/>
+            </w:tcMar>
+          </w:tcPr>
+          <w:p>
+            <w:pPr>
+              <w:spacing w:after="0"/>
+            </w:pPr>
+            <w:r>
+              <w:rPr>
+                <w:b w:val="false"/>
+                <w:bCs w:val="false"/>
+                <w:sz w:val="18"/>
+                <w:szCs w:val="18"/>
+              </w:rPr>
+              <w:t xml:space="preserve">Avviso per e-mail quando l'aggiornamento non riesce (§3.4, §8.1).</w:t>
+            </w:r>
+          </w:p>
+        </w:tc>
+      </w:tr>
+      <w:tr>
+        <w:trPr>
+          <w:tblHeader w:val="off"/>
+        </w:trPr>
+        <w:tc>
+          <w:tcPr>
+            <w:tcW w:type="dxa" w:w="3551"/>
+            <w:tcBorders>
+              <w:top w:val="single" w:color="A6A6A6" w:sz="4"/>
+              <w:left w:val="single" w:color="A6A6A6" w:sz="4"/>
+              <w:bottom w:val="single" w:color="A6A6A6" w:sz="4"/>
+              <w:right w:val="single" w:color="A6A6A6" w:sz="4"/>
+            </w:tcBorders>
+            <w:tcMar>
+              <w:top w:type="dxa" w:w="40"/>
+              <w:left w:type="dxa" w:w="80"/>
+              <w:bottom w:type="dxa" w:w="40"/>
+              <w:right w:type="dxa" w:w="80"/>
+            </w:tcMar>
+          </w:tcPr>
+          <w:p>
+            <w:pPr>
+              <w:spacing w:after="0"/>
+            </w:pPr>
+            <w:r>
+              <w:rPr>
+                <w:rFonts w:ascii="Consolas" w:cs="Consolas" w:eastAsia="Consolas" w:hAnsi="Consolas"/>
+                <w:b w:val="false"/>
+                <w:bCs w:val="false"/>
+                <w:color w:val="7A1F1F"/>
+                <w:sz w:val="18"/>
+                <w:szCs w:val="18"/>
+              </w:rPr>
+              <w:t xml:space="preserve">.github/workflows/*.yml</w:t>
+            </w:r>
+          </w:p>
+        </w:tc>
+        <w:tc>
+          <w:tcPr>
+            <w:tcW w:type="dxa" w:w="1925"/>
+            <w:tcBorders>
+              <w:top w:val="single" w:color="A6A6A6" w:sz="4"/>
+              <w:left w:val="single" w:color="A6A6A6" w:sz="4"/>
+              <w:bottom w:val="single" w:color="A6A6A6" w:sz="4"/>
+              <w:right w:val="single" w:color="A6A6A6" w:sz="4"/>
+            </w:tcBorders>
+            <w:tcMar>
+              <w:top w:type="dxa" w:w="40"/>
+              <w:left w:type="dxa" w:w="80"/>
+              <w:bottom w:type="dxa" w:w="40"/>
+              <w:right w:type="dxa" w:w="80"/>
+            </w:tcMar>
+          </w:tcPr>
+          <w:p>
+            <w:pPr>
+              <w:spacing w:after="0"/>
+            </w:pPr>
+            <w:r>
+              <w:rPr>
+                <w:b w:val="false"/>
+                <w:bCs w:val="false"/>
+                <w:sz w:val="18"/>
+                <w:szCs w:val="18"/>
+              </w:rPr>
+              <w:t xml:space="preserve">7, 8, 9, 10, 11</w:t>
+            </w:r>
+          </w:p>
+        </w:tc>
+        <w:tc>
+          <w:tcPr>
+            <w:tcW w:type="dxa" w:w="4162"/>
+            <w:tcBorders>
+              <w:top w:val="single" w:color="A6A6A6" w:sz="4"/>
+              <w:left w:val="single" w:color="A6A6A6" w:sz="4"/>
+              <w:bottom w:val="single" w:color="A6A6A6" w:sz="4"/>
+              <w:right w:val="single" w:color="A6A6A6" w:sz="4"/>
+            </w:tcBorders>
+            <w:tcMar>
+              <w:top w:type="dxa" w:w="40"/>
+              <w:left w:type="dxa" w:w="80"/>
+              <w:bottom w:type="dxa" w:w="40"/>
+              <w:right w:type="dxa" w:w="80"/>
+            </w:tcMar>
+          </w:tcPr>
+          <w:p>
+            <w:pPr>
+              <w:spacing w:after="0"/>
+            </w:pPr>
+            <w:r>
+              <w:rPr>
+                <w:b w:val="false"/>
+                <w:bCs w:val="false"/>
+                <w:sz w:val="18"/>
+                <w:szCs w:val="18"/>
+              </w:rPr>
+              <w:t xml:space="preserve">Calendario e passi dell'aggiornamento automatico (§3.5).</w:t>
+            </w:r>
+          </w:p>
+        </w:tc>
+      </w:tr>
+      <w:tr>
+        <w:trPr>
+          <w:tblHeader w:val="off"/>
+        </w:trPr>
+        <w:tc>
+          <w:tcPr>
+            <w:tcW w:type="dxa" w:w="3551"/>
+            <w:tcBorders>
+              <w:top w:val="single" w:color="A6A6A6" w:sz="4"/>
+              <w:left w:val="single" w:color="A6A6A6" w:sz="4"/>
+              <w:bottom w:val="single" w:color="A6A6A6" w:sz="4"/>
+              <w:right w:val="single" w:color="A6A6A6" w:sz="4"/>
+            </w:tcBorders>
+            <w:tcMar>
+              <w:top w:type="dxa" w:w="40"/>
+              <w:left w:type="dxa" w:w="80"/>
+              <w:bottom w:type="dxa" w:w="40"/>
+              <w:right w:type="dxa" w:w="80"/>
+            </w:tcMar>
+          </w:tcPr>
+          <w:p>
+            <w:pPr>
+              <w:spacing w:after="0"/>
+            </w:pPr>
+            <w:r>
+              <w:rPr>
+                <w:rFonts w:ascii="Consolas" w:cs="Consolas" w:eastAsia="Consolas" w:hAnsi="Consolas"/>
+                <w:b w:val="false"/>
+                <w:bCs w:val="false"/>
+                <w:color w:val="7A1F1F"/>
+                <w:sz w:val="18"/>
+                <w:szCs w:val="18"/>
+              </w:rPr>
+              <w:t xml:space="preserve">dati/*.csv</w:t>
+            </w:r>
+            <w:r>
+              <w:rPr>
+                <w:b w:val="false"/>
+                <w:bCs w:val="false"/>
+                <w:sz w:val="18"/>
+                <w:szCs w:val="18"/>
+              </w:rPr>
+              <w:t xml:space="preserve">, </w:t>
+            </w:r>
+            <w:r>
+              <w:rPr>
+                <w:rFonts w:ascii="Consolas" w:cs="Consolas" w:eastAsia="Consolas" w:hAnsi="Consolas"/>
+                <w:b w:val="false"/>
+                <w:bCs w:val="false"/>
+                <w:color w:val="7A1F1F"/>
+                <w:sz w:val="18"/>
+                <w:szCs w:val="18"/>
+              </w:rPr>
+              <w:t xml:space="preserve">dati/aggiornamento.json</w:t>
+            </w:r>
+          </w:p>
+        </w:tc>
+        <w:tc>
+          <w:tcPr>
+            <w:tcW w:type="dxa" w:w="1925"/>
+            <w:tcBorders>
+              <w:top w:val="single" w:color="A6A6A6" w:sz="4"/>
+              <w:left w:val="single" w:color="A6A6A6" w:sz="4"/>
+              <w:bottom w:val="single" w:color="A6A6A6" w:sz="4"/>
+              <w:right w:val="single" w:color="A6A6A6" w:sz="4"/>
+            </w:tcBorders>
+            <w:tcMar>
+              <w:top w:type="dxa" w:w="40"/>
+              <w:left w:type="dxa" w:w="80"/>
+              <w:bottom w:type="dxa" w:w="40"/>
+              <w:right w:type="dxa" w:w="80"/>
+            </w:tcMar>
+          </w:tcPr>
+          <w:p>
+            <w:pPr>
+              <w:spacing w:after="0"/>
+            </w:pPr>
+            <w:r>
+              <w:rPr>
+                <w:b w:val="false"/>
+                <w:bCs w:val="false"/>
+                <w:sz w:val="18"/>
+                <w:szCs w:val="18"/>
+              </w:rPr>
+              <w:t xml:space="preserve">7, 8, 9, 10, 11</w:t>
+            </w:r>
+          </w:p>
+        </w:tc>
+        <w:tc>
+          <w:tcPr>
+            <w:tcW w:type="dxa" w:w="4162"/>
+            <w:tcBorders>
+              <w:top w:val="single" w:color="A6A6A6" w:sz="4"/>
+              <w:left w:val="single" w:color="A6A6A6" w:sz="4"/>
+              <w:bottom w:val="single" w:color="A6A6A6" w:sz="4"/>
+              <w:right w:val="single" w:color="A6A6A6" w:sz="4"/>
+            </w:tcBorders>
+            <w:tcMar>
+              <w:top w:type="dxa" w:w="40"/>
+              <w:left w:type="dxa" w:w="80"/>
+              <w:bottom w:type="dxa" w:w="40"/>
+              <w:right w:type="dxa" w:w="80"/>
+            </w:tcMar>
+          </w:tcPr>
+          <w:p>
+            <w:pPr>
+              <w:spacing w:after="0"/>
+            </w:pPr>
+            <w:r>
+              <w:rPr>
+                <w:b w:val="false"/>
+                <w:bCs w:val="false"/>
+                <w:sz w:val="18"/>
+                <w:szCs w:val="18"/>
+              </w:rPr>
+              <w:t xml:space="preserve">Dati letti dalla pagina e stato dell'ultimo aggiornamento. Il contenuto dei CSV è descritto in </w:t>
+            </w:r>
+            <w:r>
+              <w:rPr>
+                <w:rFonts w:ascii="Consolas" w:cs="Consolas" w:eastAsia="Consolas" w:hAnsi="Consolas"/>
+                <w:b w:val="false"/>
+                <w:bCs w:val="false"/>
+                <w:color w:val="7A1F1F"/>
+                <w:sz w:val="18"/>
+                <w:szCs w:val="18"/>
+              </w:rPr>
+              <w:t xml:space="preserve">02_TABELLE_DI_OUTPUT.md</w:t>
+            </w:r>
+            <w:r>
+              <w:rPr>
+                <w:b w:val="false"/>
+                <w:bCs w:val="false"/>
+                <w:sz w:val="18"/>
+                <w:szCs w:val="18"/>
+              </w:rPr>
+              <w:t xml:space="preserve">, nei paragrafi «Dati di input».</w:t>
+            </w:r>
+          </w:p>
+        </w:tc>
+      </w:tr>
+    </w:tbl>
+    <w:p>
+      <w:pPr>
+        <w:spacing w:after="60"/>
+      </w:pPr>
+    </w:p>
+    <w:p>
+      <w:r>
+        <w:t xml:space="preserve">Il sito Commercio estero (</w:t>
       </w:r>
       <w:r>
         <w:rPr>
@@ -2988,10 +3913,10 @@
           <w:sz w:val="18"/>
           <w:szCs w:val="18"/>
         </w:rPr>
-        <w:t xml:space="preserve">index.html</w:t>
-      </w:r>
-      <w:r>
-        <w:t xml:space="preserve">) e le istruzioni per l'ufficio (</w:t>
+        <w:t xml:space="preserve">2_…</w:t>
+      </w:r>
+      <w:r>
+        <w:t xml:space="preserve">) ha solo </w:t>
       </w:r>
       <w:r>
         <w:rPr>
@@ -3000,10 +3925,46 @@
           <w:sz w:val="18"/>
           <w:szCs w:val="18"/>
         </w:rPr>
+        <w:t xml:space="preserve">index.html</w:t>
+      </w:r>
+      <w:r>
+        <w:t xml:space="preserve"> e </w:t>
+      </w:r>
+      <w:r>
+        <w:rPr>
+          <w:rFonts w:ascii="Consolas" w:cs="Consolas" w:eastAsia="Consolas" w:hAnsi="Consolas"/>
+          <w:color w:val="7A1F1F"/>
+          <w:sz w:val="18"/>
+          <w:szCs w:val="18"/>
+        </w:rPr>
         <w:t xml:space="preserve">LEGGIMI.txt</w:t>
       </w:r>
       <w:r>
-        <w:t xml:space="preserve">). I siti con dati automatici contengono anche:</w:t>
+        <w:t xml:space="preserve">, perché scarica i dati da ISTAT Coeweb al momento. Anche il sito Imprese (</w:t>
+      </w:r>
+      <w:r>
+        <w:rPr>
+          <w:rFonts w:ascii="Consolas" w:cs="Consolas" w:eastAsia="Consolas" w:hAnsi="Consolas"/>
+          <w:color w:val="7A1F1F"/>
+          <w:sz w:val="18"/>
+          <w:szCs w:val="18"/>
+        </w:rPr>
+        <w:t xml:space="preserve">6_…</w:t>
+      </w:r>
+      <w:r>
+        <w:t xml:space="preserve">) ha solo questi due file, perché lavora sui file caricati dall'ufficio. Il sito unico (</w:t>
+      </w:r>
+      <w:r>
+        <w:rPr>
+          <w:rFonts w:ascii="Consolas" w:cs="Consolas" w:eastAsia="Consolas" w:hAnsi="Consolas"/>
+          <w:color w:val="7A1F1F"/>
+          <w:sz w:val="18"/>
+          <w:szCs w:val="18"/>
+        </w:rPr>
+        <w:t xml:space="preserve">12_…</w:t>
+      </w:r>
+      <w:r>
+        <w:t xml:space="preserve">) contiene:</w:t>
       </w:r>
     </w:p>
     <w:p>
@@ -3016,31 +3977,16 @@
         <w:spacing w:after="40"/>
       </w:pPr>
       <w:r>
-        <w:t xml:space="preserve">gli script di estrazione ed elaborazione (</w:t>
-      </w:r>
-      <w:r>
         <w:rPr>
           <w:rFonts w:ascii="Consolas" w:cs="Consolas" w:eastAsia="Consolas" w:hAnsi="Consolas"/>
           <w:color w:val="7A1F1F"/>
           <w:sz w:val="18"/>
           <w:szCs w:val="18"/>
         </w:rPr>
-        <w:t xml:space="preserve">aggiorna_dati.py</w:t>
-      </w:r>
-      <w:r>
-        <w:t xml:space="preserve">, </w:t>
-      </w:r>
-      <w:r>
-        <w:rPr>
-          <w:rFonts w:ascii="Consolas" w:cs="Consolas" w:eastAsia="Consolas" w:hAnsi="Consolas"/>
-          <w:color w:val="7A1F1F"/>
-          <w:sz w:val="18"/>
-          <w:szCs w:val="18"/>
-        </w:rPr>
-        <w:t xml:space="preserve">aggiorna_cig.py</w:t>
-      </w:r>
-      <w:r>
-        <w:t xml:space="preserve">);</w:t>
+        <w:t xml:space="preserve">costruisci_sito.py</w:t>
+      </w:r>
+      <w:r>
+        <w:t xml:space="preserve">;</w:t>
       </w:r>
     </w:p>
     <w:p>
@@ -3053,19 +3999,16 @@
         <w:spacing w:after="40"/>
       </w:pPr>
       <w:r>
-        <w:t xml:space="preserve">lo script degli avvisi (</w:t>
-      </w:r>
-      <w:r>
         <w:rPr>
           <w:rFonts w:ascii="Consolas" w:cs="Consolas" w:eastAsia="Consolas" w:hAnsi="Consolas"/>
           <w:color w:val="7A1F1F"/>
           <w:sz w:val="18"/>
           <w:szCs w:val="18"/>
         </w:rPr>
-        <w:t xml:space="preserve">segnala_problemi.py</w:t>
-      </w:r>
-      <w:r>
-        <w:t xml:space="preserve">);</w:t>
+        <w:t xml:space="preserve">sorgenti/</w:t>
+      </w:r>
+      <w:r>
+        <w:t xml:space="preserve"> (grafica, logo, font);</w:t>
       </w:r>
     </w:p>
     <w:p>
@@ -3078,32 +4021,21 @@
         <w:spacing w:after="40"/>
       </w:pPr>
       <w:r>
-        <w:t xml:space="preserve">il workflow GitHub (</w:t>
-      </w:r>
-      <w:r>
         <w:rPr>
           <w:rFonts w:ascii="Consolas" w:cs="Consolas" w:eastAsia="Consolas" w:hAnsi="Consolas"/>
           <w:color w:val="7A1F1F"/>
           <w:sz w:val="18"/>
           <w:szCs w:val="18"/>
         </w:rPr>
-        <w:t xml:space="preserve">.github/workflows/</w:t>
-      </w:r>
-      <w:r>
-        <w:t xml:space="preserve">);</w:t>
-      </w:r>
-    </w:p>
-    <w:p>
-      <w:pPr>
-        <w:pStyle w:val="ListParagraph"/>
-        <w:numPr>
-          <w:ilvl w:val="0"/>
-          <w:numId w:val="3"/>
-        </w:numPr>
-        <w:spacing w:after="40"/>
-      </w:pPr>
-      <w:r>
-        <w:t xml:space="preserve">i dati (</w:t>
+        <w:t xml:space="preserve">sito/</w:t>
+      </w:r>
+      <w:r>
+        <w:t xml:space="preserve">, il risultato pubblicato (§3.6).</w:t>
+      </w:r>
+    </w:p>
+    <w:p>
+      <w:r>
+        <w:t xml:space="preserve">L'estrattore Python (</w:t>
       </w:r>
       <w:r>
         <w:rPr>
@@ -3112,10 +4044,70 @@
           <w:sz w:val="18"/>
           <w:szCs w:val="18"/>
         </w:rPr>
-        <w:t xml:space="preserve">dati/</w:t>
-      </w:r>
-      <w:r>
-        <w:t xml:space="preserve">).</w:t>
+        <w:t xml:space="preserve">1_…</w:t>
+      </w:r>
+      <w:r>
+        <w:t xml:space="preserve">) è descritto al §3.7.</w:t>
+      </w:r>
+    </w:p>
+    <w:p>
+      <w:r>
+        <w:rPr>
+          <w:b/>
+          <w:bCs/>
+        </w:rPr>
+        <w:t xml:space="preserve">Provare in locale</w:t>
+      </w:r>
+      <w:r>
+        <w:t xml:space="preserve">: </w:t>
+      </w:r>
+      <w:r>
+        <w:rPr>
+          <w:rFonts w:ascii="Consolas" w:cs="Consolas" w:eastAsia="Consolas" w:hAnsi="Consolas"/>
+          <w:color w:val="7A1F1F"/>
+          <w:sz w:val="18"/>
+          <w:szCs w:val="18"/>
+        </w:rPr>
+        <w:t xml:space="preserve">python3 -m http.server 8000</w:t>
+      </w:r>
+      <w:r>
+        <w:t xml:space="preserve"> dentro </w:t>
+      </w:r>
+      <w:r>
+        <w:rPr>
+          <w:rFonts w:ascii="Consolas" w:cs="Consolas" w:eastAsia="Consolas" w:hAnsi="Consolas"/>
+          <w:color w:val="7A1F1F"/>
+          <w:sz w:val="18"/>
+          <w:szCs w:val="18"/>
+        </w:rPr>
+        <w:t xml:space="preserve">codice/</w:t>
+      </w:r>
+      <w:r>
+        <w:t xml:space="preserve">, poi aprire ad esempio </w:t>
+      </w:r>
+      <w:r>
+        <w:rPr>
+          <w:rFonts w:ascii="Consolas" w:cs="Consolas" w:eastAsia="Consolas" w:hAnsi="Consolas"/>
+          <w:color w:val="7A1F1F"/>
+          <w:sz w:val="18"/>
+          <w:szCs w:val="18"/>
+        </w:rPr>
+        <w:t xml:space="preserve">http://localhost:8000/7_Web_Credito_BancaItalia/</w:t>
+      </w:r>
+      <w:r>
+        <w:t xml:space="preserve"> e premere «Genera». Le pagine funzionano anche aperte con doppio clic su </w:t>
+      </w:r>
+      <w:r>
+        <w:rPr>
+          <w:rFonts w:ascii="Consolas" w:cs="Consolas" w:eastAsia="Consolas" w:hAnsi="Consolas"/>
+          <w:color w:val="7A1F1F"/>
+          <w:sz w:val="18"/>
+          <w:szCs w:val="18"/>
+        </w:rPr>
+        <w:t xml:space="preserve">index.html</w:t>
+      </w:r>
+      <w:r>
+        <w:t xml:space="preserve">: in quel caso leggono i dati automatici dai siti online.</w:t>
       </w:r>
     </w:p>
     <w:p>

</xml_diff>